<commit_message>
Close the ASQA open item across docs; drop stale BLEND headline
The ASQA per-ensemble sweep is done, so the 'incomplete' note is removed from
the explainer and the sweep handoff's next-steps no longer lead with the boosted
BLEND arm that was retired yesterday.

Sweep next-steps now leads with rank scorer + budget (+15.8% / +8.1%) and adds
the ASQA contrast as a result in its own right: two mirror-image sweeps, the
same two methods, opposite verdicts.

Co-Authored-By: Claude Opus 5 <noreply@anthropic.com>
</commit_message>
<xml_diff>
--- a/docs/METHOD_EXPLAINER.docx
+++ b/docs/METHOD_EXPLAINER.docx
@@ -14923,7 +14923,7 @@
           <w:sz w:val="18"/>
           <w:szCs w:val="18"/>
         </w:rPr>
-        <w:t xml:space="preserve">The ASQA per-ensemble table is incomplete</w:t>
+        <w:t xml:space="preserve">The ASQA per-ensemble table</w:t>
       </w:r>
       <w:r>
         <w:rPr>
@@ -14931,7 +14931,7 @@
           <w:sz w:val="18"/>
           <w:szCs w:val="18"/>
         </w:rPr>
-        <w:t xml:space="preserve"> — it has counting versus weighting only; our method is not in it. Roughly 30–45 minutes, free.</w:t>
+        <w:t xml:space="preserve"> — DONE 23 August. All 42 ASQA ensembles now carry our method. It beats counting at every size (+2.7% to +8.6%, significant in 29 of 42) but loses to reliability weighting at every size, with the gap widening as the pool grows — the mirror image of QAMPARI.</w:t>
       </w:r>
     </w:p>
     <w:p>

</xml_diff>